<commit_message>
Polish methanation paper prose and figure references
</commit_message>
<xml_diff>
--- a/output/paper/fixed_bed_co_methanation_paper.docx
+++ b/output/paper/fixed_bed_co_methanation_paper.docx
@@ -16,24 +16,7 @@
           <w:color w:val="000000"/>
           <w:sz w:val="40"/>
         </w:rPr>
-        <w:t>Fixed Bed CO Methanation Reactor Model Analysis</w:t>
-      </w:r>
-    </w:p>
-    <w:p>
-      <w:pPr>
-        <w:keepNext/>
-        <w:spacing w:after="100"/>
-        <w:jc w:val="center"/>
-      </w:pPr>
-      <w:r>
-        <w:rPr>
-          <w:rFonts w:ascii="Times New Roman" w:hAnsi="Times New Roman" w:eastAsia="Times New Roman"/>
-          <w:b w:val="0"/>
-          <w:i/>
-          <w:color w:val="333333"/>
-          <w:sz w:val="21"/>
-        </w:rPr>
-        <w:t>Governing balances, axial profiles, and operating-condition sensitivity</w:t>
+        <w:t>One-Dimensional Modeling of CO Methanation in a Fixed-Bed Reactor</w:t>
       </w:r>
     </w:p>
     <w:p>
@@ -83,7 +66,7 @@
           <w:color w:val="000000"/>
           <w:sz w:val="19"/>
         </w:rPr>
-        <w:t>A one-dimensional fixed-bed reactor model is used to examine CO methanation, compare independent literature kinetics with the reported Experiment 1 result, and quantify sensitivity to selected operating inputs. The full M4 formulation couples CO and CO₂ methanation with water-gas shift, species balances, heat exchange, and Ergun pressure drop. At 350 °C and 1 bar absolute, the no-fit Full M4 prediction is 78.72% CO conversion, compared with the source-reported 40.63%. This comparison is conditional: 1 bar is below the Full M4 fitted pressure interval of 5–15 bar, and the source report gives conflicting pressure entries. A separate assumed 5 bar case predicts 95.81% conversion and a peak gas temperature of 819.7 K. Sensitivity sweeps show substantial dependence on H₂/CO ratio, catalyst space time, and nitrogen flow. These results describe model behavior under stated inputs; they do not validate the model against the experiment. Integrations used SciPy solve_ivp with the Radau or BDF stiff solver, as specified for each simulation case.</w:t>
+        <w:t>A one-dimensional fixed-bed model was used to evaluate CO methanation with the Full M4 kinetics of Celoria et al. Species, energy, and Ergun pressure balances were integrated in Python with SciPy solve_ivp using Radau or BDF. At 350 °C, 1 bar absolute, and 3.12 g catalyst, Full M4 predicts 78.72% CO conversion without parameter adjustment; the reported Experiment 1 value is 40.63%. This comparison is affected by conflicting pressure values in the source report and lies below the model's 5–15 bar fitted pressure range. A separate assumed 5 bar bed predicts 95.81% outlet conversion and a peak gas temperature of 819.7 K (546.5 °C), above the fitted temperature range of 250–400 °C. Sweeps of inlet temperature, pressure, H₂/CO ratio, catalyst space time, and N₂ flow characterize the model's response under specified conditions.</w:t>
       </w:r>
     </w:p>
     <w:p>
@@ -124,7 +107,7 @@
         <w:ind w:firstLine="259"/>
       </w:pPr>
       <w:r>
-        <w:t>CO methanation converts carbon monoxide and hydrogen to methane and water. A reactor model for this exothermic system must track changes in gas composition along with heat release and pressure loss. Literature kinetic expressions can also behave differently when transferred between catalysts or outside their fitted ranges.</w:t>
+        <w:t>CO methanation is strongly exothermic, so local rates change with gas composition and temperature along a packed bed. A reactor calculation must also account for heat exchange and pressure loss.</w:t>
       </w:r>
     </w:p>
     <w:p>
@@ -132,7 +115,7 @@
         <w:ind w:firstLine="259"/>
       </w:pPr>
       <w:r>
-        <w:t>This study applies the Full M4 rate model reported for mixed CO and CO₂ methanation to a one-dimensional fixed-bed calculation [1]. It first compares a no-fit prediction with the Experiment 1 source value at a common 1 bar basis, alongside two separate literature rate formulations [2, 3]. It then examines an assumed reactor profile and saved parameter sweeps. The comparison and sweeps retain their domain limits and input assumptions; no kinetic parameter is adjusted to match the reported conversion.</w:t>
+        <w:t>Here, the Full M4 kinetics of Celoria et al. [1] are applied to a one-dimensional fixed-bed reactor. Its unadjusted prediction at the selected Experiment 1 basis is compared with two other literature rate laws [2, 3] and the reported conversion [5]. A separate assumed 5 bar case and operating sweeps are used to examine axial behavior and input sensitivity.</w:t>
       </w:r>
     </w:p>
     <w:p>
@@ -156,7 +139,7 @@
         <w:ind w:firstLine="259"/>
       </w:pPr>
       <w:r>
-        <w:t>The bed is represented as a steady, one-dimensional plug-flow reactor. The Full M4 network contains three reversible reactions, written below in the forward directions used to define the stoichiometric matrix. The WGS rate sign is converted consistently from the published reverse water-gas-shift convention when required by a source model.</w:t>
+        <w:t>The bed is represented as a steady, one-dimensional plug-flow reactor. The Full M4 network contains three reversible reactions, written below in the forward directions used to define the stoichiometric matrix. The published reverse water-gas-shift rate is sign-reversed for the forward direction used here.</w:t>
       </w:r>
     </w:p>
     <w:p>
@@ -194,7 +177,7 @@
         <w:ind w:firstLine="259"/>
       </w:pPr>
       <w:r>
-        <w:t>Full M4 local rates are evaluated from temperature and gas partial pressures using the published Langmuir–Hinshelwood–Hougen–Watson form and central parameter values [1]. For comparison, the Kopyscinski implementation uses the corrected square-root CO adsorption term from its published corrigendum [2]. The Quindimil implementation uses its reported CO₂/H₂ kinetic basis; the limitation in transferring that rate law to a CO/H₂/N₂ inlet is treated explicitly in the results [3].</w:t>
+        <w:t>Full M4 local rates are evaluated from temperature and gas partial pressures using the published Langmuir–Hinshelwood–Hougen–Watson form and central parameter values [1]. For comparison, the Kopyscinski implementation uses the corrected square-root CO adsorption term from its published corrigendum [2]. The Quindimil implementation was fitted to CO₂/H₂ feeds [3]; applying it to the CO/H₂/N₂ comparison is outside that feed scope.</w:t>
       </w:r>
     </w:p>
     <w:p>
@@ -390,7 +373,7 @@
         <w:ind w:firstLine="259"/>
       </w:pPr>
       <w:r>
-        <w:t>The Python implementation integrates the balance equations with scipy.integrate.solve_ivp from SciPy 1.18.1 [4]. The reactor equations are solved with the implicit stiff methods Radau or BDF. The principal profile configurations use relative tolerance 10⁻⁶, absolute flow tolerance 10⁻¹⁰ mol s⁻¹, temperature tolerance 10⁻⁵ K, and pressure tolerance 0.1 Pa. The independent literature-model profiles use Radau with relative tolerance 10⁻⁸ and absolute flow tolerance 10⁻¹⁴ mol s⁻¹. Dense solver output is sampled at 401 positions for reactor profiles and 101 catalyst-mass positions for the three-model comparison. The saved sweeps report completed-bed outlet metrics.</w:t>
+        <w:t>The Python implementation integrates the balance equations with scipy.integrate.solve_ivp from SciPy 1.18.1 [4], using the implicit Radau or BDF method as listed in Table 1. The principal profile runs use relative tolerance 10⁻⁶, absolute flow tolerance 10⁻¹⁰ mol s⁻¹, temperature tolerance 10⁻⁵ K, and pressure tolerance 0.1 Pa. The independent literature-model profiles use Radau with relative tolerance 10⁻⁸ and absolute flow tolerance 10⁻¹⁴ mol s⁻¹. Dense solver output is sampled at 401 positions for reactor profiles and 101 catalyst-mass positions for the three-model comparison. Sweep results are reported at the bed outlet.</w:t>
       </w:r>
     </w:p>
     <w:p>
@@ -883,7 +866,7 @@
         <w:ind w:firstLine="259"/>
       </w:pPr>
       <w:r>
-        <w:t>The Full M4 kinetic fit covers 250–400 °C and 5–15 bar. Values interpolated between the reported fit nodes remain model interpolations. The 1 bar Experiment 1 comparisons and sensitivities are pressure extrapolations. The assumed reactor case uses a 0.0254 m tube, 0.3048 m bed, 0.4 void fraction, 3 mm particles, and 750 kg catalyst m⁻³ bed; these are specified modelling inputs, not dimensions or packing measurements confirmed by Experiment 1.</w:t>
+        <w:t>The Full M4 kinetic fit covers 250–400 °C and 5–15 bar. The 1 bar Experiment 1 comparison and sensitivity runs are pressure extrapolations. The assumed reactor case uses a 0.0254 m tube, 0.3048 m bed, 0.4 void fraction, 3 mm particles, and 750 kg catalyst m⁻³ bed; these are specified modeling inputs, not dimensions or packing measurements confirmed by Experiment 1.</w:t>
       </w:r>
     </w:p>
     <w:p>
@@ -899,7 +882,7 @@
         <w:pStyle w:val="Heading2"/>
       </w:pPr>
       <w:r>
-        <w:t>No-fit comparison with Experiment 1</w:t>
+        <w:t>Comparison with Experiment 1</w:t>
       </w:r>
     </w:p>
     <w:p>
@@ -1420,7 +1403,15 @@
         <w:ind w:firstLine="259"/>
       </w:pPr>
       <w:r>
-        <w:t>Full M4 overpredicts the source value by 38.09 percentage points under this one-bar basis. The pressure choice is itself uncertain in the source material: its abstract and discussion describe atmospheric operation, while Appendix A lists 2 bar. This comparison uses 1 bar absolute. The Full M4 prediction therefore lies below its fitted pressure range. The Kopyscinski result is at the edge of its stated pressure range, but the catalyst formulation and reactor arrangement differ from the current case. The Quindimil model was fitted to CO₂/H₂ methanation, so applying it to a CO/H₂/N₂ feed extrapolates the feed scope as well as the pressure. Its implementation is reduced relative to the full printed rate expression because the source parameter table does not provide an independent K_H₂ value for one denominator term. The three predictions are thus transferability checks, not a ranking against a shared catalyst dataset.</w:t>
+        <w:t>Table 2 and Figure 1 show that Full M4 predicts 78.72% conversion at the selected 1 bar basis, 38.09 percentage points above the reported 40.63%. The source describes atmospheric operation in its abstract and discussion but lists 2 bar in Appendix A [5]. The 1 bar calculation is below the Full M4 fitted pressure interval.</w:t>
+      </w:r>
+    </w:p>
+    <w:p>
+      <w:pPr>
+        <w:ind w:firstLine="259"/>
+      </w:pPr>
+      <w:r>
+        <w:t>Kopyscinski predicts nearly complete conversion, but it describes a different catalyst and reactor. Quindimil's rate law was fitted to CO₂/H₂ feeds and is evaluated below its pressure range here. Its implemented expression is also reduced because the published parameter table lacks an independent K_H₂ required by one denominator term. These results assess transfer of literature kinetics across different conditions; they do not rank models for a common catalyst.</w:t>
       </w:r>
     </w:p>
     <w:p>
@@ -1476,7 +1467,7 @@
         <w:t xml:space="preserve">Figure 1. </w:t>
       </w:r>
       <w:r>
-        <w:t>CO conversion versus catalyst mass for the three independent no-fit models. The horizontal dashed line and circular point mark the source-reported Experiment 1 conversion at 3.12 g. The models are evaluated separately at 1 bar; curves are not fitted to the measured point.</w:t>
+        <w:t>CO conversion versus catalyst mass for three literature models evaluated without refitting. The dashed line and circular point mark the reported Experiment 1 conversion at 3.12 g.</w:t>
       </w:r>
     </w:p>
     <w:p>
@@ -1492,7 +1483,7 @@
         <w:ind w:firstLine="259"/>
       </w:pPr>
       <w:r>
-        <w:t>The illustrative profile uses a total inlet flow of 0.05 mol s⁻¹ at 350 °C and 5 bar, with CO:H₂:N₂ = 1:4:25. The bed has a 1 in diameter and 12 in length, a specified void fraction of 0.4, and 3 mm particles. Heat exchange is enabled with a 350 °C wall and U = 10 W m⁻² K⁻¹; pressure loss follows Ergun. At 0.11583 kg catalyst, the model predicts 95.81% outlet CO conversion and 87.33% methane yield. The peak gas temperature is 819.66 K (546.5 °C), reached about 3.5 cm into the bed, and the outlet pressure is 4.9405 bar.</w:t>
+        <w:t>Figure 2 shows the assumed 5 bar Full M4 bed described in Table 1. The total inlet flow is 0.05 mol s⁻¹ with CO:H₂:N₂ = 1:4:25; the wall is held at 350 °C with U = 10 W m⁻² K⁻¹. At 0.11583 kg catalyst, the model predicts 95.81% outlet CO conversion and 87.33% methane yield. Gas temperature peaks at 819.66 K (546.5 °C) about 3.5 cm from the inlet, while pressure falls to 4.9405 bar at the outlet.</w:t>
       </w:r>
     </w:p>
     <w:p>
@@ -1556,7 +1547,7 @@
         <w:ind w:firstLine="259"/>
       </w:pPr>
       <w:r>
-        <w:t>The species profiles show CO depletion with CH₄ and H₂O formation over the same inlet region. CO₂ remains a minor intermediate in this assumed case, while N₂ is inert in the reaction network. The displayed concentration range omits N₂ so the reactive species remain legible. The predicted hot spot exceeds the 400 °C upper kinetic-fit temperature, so rates in part of this profile involve temperature extrapolation. The high conversion does not establish reactor performance because the geometry, thermal boundary condition, feed and loading are assumptions.</w:t>
+        <w:t>In Figure 3, CO depletion coincides with CH₄ and H₂O formation near the inlet. CO₂ remains a minor intermediate; N₂ is included in the material balance but omitted from the plot scale. The calculated hot spot exceeds the 400 °C upper kinetic-fit temperature, so rates in part of the bed require temperature extrapolation.</w:t>
       </w:r>
     </w:p>
     <w:p>
@@ -1628,7 +1619,7 @@
         <w:ind w:firstLine="259"/>
       </w:pPr>
       <w:r>
-        <w:t>The stored 22 × 22 Full M4 sweep completed all 484 cases across 250–400 °C and 1–15 bar. This contour focuses on the published 5–15 bar pressure-fit interval, where outlet conversion ranges from 92.01% to 99.86%. The nominal 350 °C and 5 bar point gives 95.81%; the 1–&lt;5 bar cases are omitted from this figure because they lie outside the Full M4 pressure-fit range.</w:t>
+        <w:t>Figure 4 shows the 5–15 bar subset of a 22 × 22 Full M4 sweep over 250–400 °C and 1–15 bar. All 484 runs completed. Over the plotted pressure interval, outlet conversion ranges from 92.01% to 99.86%; the nominal 350 °C, 5 bar point gives 95.81%. Cases below 5 bar are omitted because they lie outside the fitted pressure range.</w:t>
       </w:r>
     </w:p>
     <w:p>
@@ -1692,7 +1683,7 @@
         <w:ind w:firstLine="259"/>
       </w:pPr>
       <w:r>
-        <w:t>Inlet conditions inside the published fit rectangle do not guarantee that every local bed state remains in the fit domain. Across the full saved sweep, 469 of 484 runs reach a sampled peak bed temperature above 400 °C; the peak-temperature range is 288.4–603.1 °C. The contour is conditional on the assumed feed, geometry and heat transfer. Many bed trajectories also use local temperature extrapolation even though their inlet temperatures fall within the reported range.</w:t>
+        <w:t>Inlet conditions within the fitted interval do not guarantee that the entire bed stays there. Across all 484 runs, including those below 5 bar, 469 reach a sampled peak bed temperature above 400 °C; peak temperatures range from 288.4 to 603.1 °C. Many plotted trajectories therefore involve local temperature extrapolation.</w:t>
       </w:r>
     </w:p>
     <w:p>
@@ -1708,7 +1699,7 @@
         <w:ind w:firstLine="259"/>
       </w:pPr>
       <w:r>
-        <w:t>The 462-cell isothermal Full M4 sweep varied H₂/CO from 1 to 5 and catalyst space time from 8.775 to 140.4 kg_cat s mol_CO⁻¹ at 350 °C and 1 bar. Catalyst mass was held at 3.12 g; CO and N₂ flows were scaled together, H₂ was reset from the selected ratio, and N₂/CO was held at the Experiment 1 value. The predicted conversion range is 22.38–99.04%. At the reference ratio of 2.9969 and space time of 35.10 kg_cat s mol_CO⁻¹, the model returns 78.72%. Increasing H₂/CO or space time generally raises conversion over the sampled region, with diminishing change toward the high-conversion boundary.</w:t>
+        <w:t>Figure 5 summarizes a 462-case isothermal Full M4 sweep of H₂/CO from 1 to 5 and catalyst space time from 8.775 to 140.4 kg_cat s mol_CO⁻¹ at 350 °C and 1 bar. Catalyst mass was held at 3.12 g; CO and N₂ flows were scaled together, H₂ was reset from the selected ratio, and N₂/CO was held at the Experiment 1 value. Outlet conversion ranges from 22.38–99.04%. At the reference ratio of 2.9969 and space time of 35.10 kg_cat s mol_CO⁻¹, the model returns 78.72%. Increasing H₂/CO or space time generally raises conversion over the sampled region, with diminishing change toward the high-conversion boundary.</w:t>
       </w:r>
     </w:p>
     <w:p>
@@ -1764,7 +1755,7 @@
         <w:t xml:space="preserve">Figure 5. </w:t>
       </w:r>
       <w:r>
-        <w:t>Full M4 outlet conversion across the H₂/CO and catalyst-space-time grid. The circular point marks the 1 bar Experiment 1 reference calculation. All cells are isothermal no-fit predictions below the 5–15 bar Full M4 pressure-fit interval.</w:t>
+        <w:t>Full M4 outlet conversion across the H₂/CO and catalyst-space-time grid. The circular point marks the 1 bar Experiment 1 reference calculation. All cells are isothermal predictions without refitting and lie below the 5–15 bar Full M4 pressure-fit interval.</w:t>
       </w:r>
     </w:p>
     <w:p>
@@ -1780,7 +1771,7 @@
         <w:ind w:firstLine="259"/>
       </w:pPr>
       <w:r>
-        <w:t>Two saved 1 bar contours vary absolute inlet flows while holding temperature at 350 °C and catalyst mass at 3.12 g. The first varies H₂ and CO with N₂ fixed at 0.799 mol h⁻¹. The second varies H₂ and N₂ with CO fixed at 0.320 mol h⁻¹. The combined grid contains 819 completed cases and predicts 15.91–92.30% conversion. Both panels are conditional Full M4 sensitivities; the 1 bar pressure is outside the 5–15 bar fitted interval.</w:t>
+        <w:t>Figure 6 varies absolute inlet flows at 350 °C, 1 bar, and 3.12 g catalyst. Panel (a) varies H₂ and CO with N₂ fixed at 0.799 mol h⁻¹; panel (b) varies H₂ and N₂ with CO fixed at 0.320 mol h⁻¹. The two grids contain 819 completed cases, with predicted conversion from 15.91% to 92.30%. The pressure is below the Full M4 fitted interval.</w:t>
       </w:r>
     </w:p>
     <w:p>
@@ -1836,7 +1827,7 @@
         <w:t xml:space="preserve">Figure 6. </w:t>
       </w:r>
       <w:r>
-        <w:t>No-fit Full M4 feed-flow sensitivity at 1 bar. Panel (a) varies CO and H₂ at fixed N₂; panel (b) varies N₂ and H₂ at fixed CO. Circular points show the Experiment 1 inlet flows. A common color scale is used.</w:t>
+        <w:t>Full M4 feed-flow sensitivity at 1 bar. Panel (a) varies CO and H₂ at fixed N₂; panel (b) varies N₂ and H₂ at fixed CO. Circular points mark the Experiment 1 inlet flows; both panels share a color scale.</w:t>
       </w:r>
     </w:p>
     <w:p>
@@ -1844,7 +1835,7 @@
         <w:ind w:firstLine="259"/>
       </w:pPr>
       <w:r>
-        <w:t>At fixed N₂, conversion increases as H₂ supply rises relative to CO. In the second panel, increasing N₂ at fixed CO and H₂ lowers the calculated conversion because inert dilution and total inlet throughput change together. These contours should not be interpreted as an independent effect of total flow or dilution without specifying which inlet streams remain fixed.</w:t>
+        <w:t>At fixed N₂, conversion rises with H₂ supply relative to CO. In panel (b), added N₂ lowers conversion at fixed reactive flows; dilution and total inlet flow both change.</w:t>
       </w:r>
     </w:p>
     <w:p>
@@ -1852,7 +1843,7 @@
         <w:pStyle w:val="Heading2"/>
       </w:pPr>
       <w:r>
-        <w:t>Isolated nitrogen-flow sensitivity</w:t>
+        <w:t>Nitrogen-flow sensitivity at fixed reactive flows</w:t>
       </w:r>
     </w:p>
     <w:p>
@@ -1860,7 +1851,7 @@
         <w:ind w:firstLine="259"/>
       </w:pPr>
       <w:r>
-        <w:t>The 42-case N₂ sweep holds CO at 0.320 mol h⁻¹ and H₂ at 0.959 mol h⁻¹ while varying N₂ from 0.400 to 1.200 mol h⁻¹. Predicted conversion falls from 88.14% to 70.34%; the reference N₂ flow of 0.799 mol h⁻¹ gives 78.72%. Since reactive flows are fixed, this curve captures the combined effect of added dilution and increased total flow. It is a conditional 1 bar model sensitivity, not experimental validation.</w:t>
+        <w:t>Figure 7 shows a 42-case N₂ sweep with CO held at 0.320 mol h⁻¹ and H₂ at 0.959 mol h⁻¹. As N₂ varies from 0.400 to 1.200 mol h⁻¹, predicted conversion falls from 88.14% to 70.34%; the reference N₂ flow of 0.799 mol h⁻¹ gives 78.72%. Since reactive flows are fixed, the curve captures the combined effect of dilution and increased total flow at 1 bar, below the fitted pressure range.</w:t>
       </w:r>
     </w:p>
     <w:p>
@@ -1933,7 +1924,7 @@
         <w:ind w:firstLine="259"/>
       </w:pPr>
       <w:r>
-        <w:t>The coupled fixed-bed calculation produces internally consistent conversion, temperature, composition and pressure profiles and supports controlled parameter sweeps. At the selected one-bar Experiment 1 basis, Full M4 predicts 78.72% CO conversion against the reported 40.63%, with no parameter fitting. The difference, the source pressure inconsistency, and the Full M4 pressure-fit limit prevent treating this comparison as validation. The assumed 5 bar profile also reaches a gas temperature above the published kinetic-fit range. The sensitivity maps are useful for identifying model response to feed composition and catalyst space time, but their conclusions remain conditional on the assumed geometry, thermal inputs and kinetic domain. Experimental validation requires a resolved pressure basis, confirmed reactor dimensions and packing, and matched catalyst kinetic data over the local temperature and pressure histories.</w:t>
+        <w:t>At the selected 1 bar Experiment 1 conditions, Full M4 predicts 78.72% CO conversion, compared with the reported 40.63%. Because 1 bar lies below the fitted pressure range and the source gives conflicting pressure values, this difference does not establish predictive accuracy. In the separate assumed 5 bar bed, conversion reaches 95.81%, but the calculated 546.5 °C hot spot exceeds the published temperature-fit range. Over the specified sensitivity cases, conversion rises with H₂/CO and catalyst space time and falls as N₂ flow increases at fixed CO and H₂. An experimental comparison requires a resolved pressure basis, measured reactor geometry and packing, and kinetics for the catalyst and local bed conditions.</w:t>
       </w:r>
     </w:p>
     <w:p>
@@ -2110,7 +2101,7 @@
         <w:color w:val="333333"/>
         <w:sz w:val="16"/>
       </w:rPr>
-      <w:t>Fixed Bed CO Methanation Reactor Model Analysis</w:t>
+      <w:t>CO Methanation in a Fixed-Bed Reactor</w:t>
     </w:r>
   </w:p>
 </w:hdr>

</xml_diff>